<commit_message>
Bruno & Marrone: revisão da Parte 3 (anti-IA, conectores, microgancho)
Co-Authored-By: Claude Opus 5.5 <noreply@anthropic.com>
Claude-Session: https://claude.ai/code/session_01MJjUEEZrxQDEUifKK2vj9g
</commit_message>
<xml_diff>
--- a/roteiros/bruno-marrone/BrunoMarrone_Parte3.docx
+++ b/roteiros/bruno-marrone/BrunoMarrone_Parte3.docx
@@ -63,7 +63,7 @@
         <w:rPr>
           <w:color w:val="000000"/>
         </w:rPr>
-        <w:t>Mas quem estava no palco ao lado de Bruno sabia que o problema não tinha ficado em Patos de Minas.</w:t>
+        <w:t>Mas quem estava no palco ao lado de Bruno sabia que o problema tinha subido no ônibus da dupla e seguido viagem.</w:t>
       </w:r>
     </w:p>
     <w:p>
@@ -71,7 +71,7 @@
         <w:rPr>
           <w:color w:val="C00000"/>
         </w:rPr>
-        <w:t>E é aqui que você precisa conhecer melhor o homem que estava do outro lado do palco. Porque, para entender por que Marrone aguentou tanto tempo em silêncio, você precisa saber de onde ele veio.</w:t>
+        <w:t>É aqui que você precisa conhecer melhor o homem que estava do outro lado do palco. Porque só dá para entender por que Marrone aguentou tanto tempo em silêncio quando se sabe de onde ele veio.</w:t>
       </w:r>
     </w:p>
     <w:p>
@@ -103,7 +103,7 @@
         <w:rPr>
           <w:color w:val="000000"/>
         </w:rPr>
-        <w:t>Quando conheceu Bruno, Marrone já sabia o que era passar necessidade. Sabia o valor de cada cachê. E sabia o que significava perder tudo por descuido.</w:t>
+        <w:t>Quando conheceu Bruno, Marrone já sabia o que era passar necessidade. Sabia quanto custava cada cachê conquistado num bar de beira de estrada.</w:t>
       </w:r>
     </w:p>
     <w:p>
@@ -111,7 +111,7 @@
         <w:rPr>
           <w:color w:val="000000"/>
         </w:rPr>
-        <w:t>Durante décadas, ele foi o lado que protegia a dupla. Protegia o nome e a banda que dependia deles. E, quando era preciso, protegia a si mesmo.</w:t>
+        <w:t>Durante décadas, foi ele quem cuidou do nome da dupla e da banda que dependia dos dois. Quando era preciso, cuidava também de si mesmo.</w:t>
       </w:r>
     </w:p>
     <w:p>
@@ -127,7 +127,7 @@
         <w:rPr>
           <w:color w:val="000000"/>
         </w:rPr>
-        <w:t>E, em março de dois mil e vinte, o mundo parou.</w:t>
+        <w:t>Em março de dois mil e vinte, o mundo parou.</w:t>
       </w:r>
     </w:p>
     <w:p>
@@ -157,9 +157,9 @@
     <w:p>
       <w:r>
         <w:rPr>
-          <w:color w:val="000000"/>
+          <w:color w:val="C00000"/>
         </w:rPr>
-        <w:t>E foi numa dessas lives que o Brasil inteiro viu, pela primeira vez sem filtro, o que acontecia nos bastidores de Bruno e Marrone.</w:t>
+        <w:t>E foi numa dessas lives que o Brasil inteiro viu, ao vivo e sem edição, o que acontecia nos bastidores de Bruno e Marrone. Guarde bem o rosto de Marrone naquela noite, porque ele diz mais do que qualquer palavra.</w:t>
       </w:r>
     </w:p>
     <w:p>
@@ -215,7 +215,7 @@
         <w:rPr>
           <w:color w:val="000000"/>
         </w:rPr>
-        <w:t>Em certo momento, admitiu diante de milhões de pessoas que estava bêbado.</w:t>
+        <w:t>Em certo momento, admitiu ao vivo que estava bêbado.</w:t>
       </w:r>
     </w:p>
     <w:p>
@@ -223,7 +223,7 @@
         <w:rPr>
           <w:color w:val="C00000"/>
         </w:rPr>
-        <w:t>E aqui vem um número que diz muito sobre o país. Na manhã seguinte, aquela live já tinha vinte e um milhões de visualizações. Vinte e um milhões. E a maior parte das pessoas assistia rindo.</w:t>
+        <w:t>Agora escute um número que diz muito sobre o país. Na manhã seguinte, aquela live já tinha vinte e um milhões de visualizações. Vinte e um milhões. E a maior parte das pessoas assistia rindo.</w:t>
       </w:r>
     </w:p>
     <w:p>
@@ -231,7 +231,7 @@
         <w:rPr>
           <w:color w:val="000000"/>
         </w:rPr>
-        <w:t>As redes sociais explodiram. Memes, cortes, piadas. Para muita gente, aquilo era divertido. Parecia uma mesa de bar com os amigos, só que transmitida para o Brasil inteiro.</w:t>
+        <w:t>As redes sociais explodiram em memes e cortes. Para muita gente, aquilo era divertido. Parecia uma mesa de bar com os amigos, só que transmitida para o Brasil inteiro.</w:t>
       </w:r>
     </w:p>
     <w:p>
@@ -255,7 +255,7 @@
         <w:rPr>
           <w:color w:val="000000"/>
         </w:rPr>
-        <w:t>Nas imagens, ele aparecia desconfortável, tentando manter o show nos trilhos. Várias vezes começava a falar e não conseguia terminar a frase. A própria transmissão passou a mostrar o rosto dele nos momentos mais absurdos da noite. Enquanto o país ria, o parceiro de trinta e cinco anos parecia querer que aquilo acabasse logo.</w:t>
+        <w:t>Nas imagens, ele aparecia desconfortável, tentando manter o show nos trilhos. Muitos dos cortes que mais circularam mostravam o rosto dele nos momentos mais absurdos da noite. Enquanto o país ria, o parceiro de trinta e cinco anos parecia querer que aquilo acabasse logo.</w:t>
       </w:r>
     </w:p>
     <w:p>
@@ -263,7 +263,7 @@
         <w:rPr>
           <w:color w:val="000000"/>
         </w:rPr>
-        <w:t>Em maio, numa nova transmissão, Bruno voltou a aparecer completamente embriagado, diante de uma plateia que incluía crianças.</w:t>
+        <w:t>Em maio, numa nova transmissão, Bruno voltou a aparecer completamente embriagado. Dessa vez, muitos pais reclamaram. Havia crianças assistindo.</w:t>
       </w:r>
     </w:p>
     <w:p>
@@ -271,7 +271,7 @@
         <w:rPr>
           <w:color w:val="000000"/>
         </w:rPr>
-        <w:t>E, no dia doze de junho, Dia dos Namorados, veio outra live. Dessa vez, o climão apareceu logo no começo. Os fãs perceberam os dois se estranhando diante das câmeras e comentaram isso ao vivo, enquanto a transmissão acontecia.</w:t>
+        <w:t>No dia doze de junho, Dia dos Namorados, veio outra live. O climão apareceu logo no começo. Os fãs perceberam os dois se estranhando diante das câmeras e comentaram isso enquanto a transmissão acontecia.</w:t>
       </w:r>
     </w:p>
     <w:p>
@@ -279,7 +279,7 @@
         <w:rPr>
           <w:color w:val="000000"/>
         </w:rPr>
-        <w:t>E, naquele mesmo período, Bruno voltou a falar demais. Numa live com outros cantores, fez uma piada transfóbica que foi duramente criticada. Marrone tentou contornar a situação ao vivo.</w:t>
+        <w:t>Naquele mesmo período, Bruno voltou a falar demais. Numa live com outros cantores, fez uma piada transfóbica que foi duramente criticada. Marrone tentou contornar a situação ao vivo.</w:t>
       </w:r>
     </w:p>
     <w:p>
@@ -327,7 +327,7 @@
         <w:rPr>
           <w:color w:val="000000"/>
         </w:rPr>
-        <w:t>E o próprio Marrone, que tinha passado anos em silêncio, decidiu falar.</w:t>
+        <w:t>O próprio Marrone, que tinha passado anos em silêncio, decidiu falar.</w:t>
       </w:r>
     </w:p>
     <w:p>
@@ -343,7 +343,7 @@
         <w:rPr>
           <w:color w:val="000000"/>
         </w:rPr>
-        <w:t>Veio a público uma entrevista em que Marrone sentou diante da câmera de um canal do YouTube dedicado à música sertaneja, o Alma Sertaneja, para uma entrevista longa com o apresentador Dudu Pucena.</w:t>
+        <w:t>Marrone sentou diante da câmera do Alma Sertaneja, um canal do YouTube dedicado à música sertaneja, para uma conversa longa com o apresentador Dudu Pucena.</w:t>
       </w:r>
     </w:p>
     <w:p>
@@ -351,7 +351,7 @@
         <w:rPr>
           <w:color w:val="000000"/>
         </w:rPr>
-        <w:t>Era uma conversa sobre carreira e sobre fé, depois de trinta e seis anos de dupla.</w:t>
+        <w:t>O assunto era carreira e fé, depois de trinta e seis anos de dupla.</w:t>
       </w:r>
     </w:p>
     <w:p>
@@ -367,7 +367,7 @@
         <w:rPr>
           <w:color w:val="C00000"/>
         </w:rPr>
-        <w:t>E agora você vai ouvir, finalmente, a frase que fez o Brasil olhar para Bruno e Marrone de outro jeito. A frase que está no título desse vídeo. E vai ouvir também o que Marrone disse logo depois, uma confissão que muita gente não percebeu na época.</w:t>
+        <w:t>Agora você vai ouvir, finalmente, a frase que fez o Brasil olhar para Bruno e Marrone de outro jeito. A frase que está no título desse vídeo. Vai ouvir também o que Marrone disse logo depois, uma confissão que muita gente deixou passar na época.</w:t>
       </w:r>
     </w:p>
     <w:p>
@@ -415,7 +415,7 @@
         <w:rPr>
           <w:color w:val="1F4EB4"/>
         </w:rPr>
-        <w:t>E então veio a confissão que muita gente não esperava ouvir de um homem conhecido pela calma.</w:t>
+        <w:t>Então veio a confissão que muita gente jamais esperava ouvir de um homem conhecido pela calma.</w:t>
       </w:r>
     </w:p>
     <w:p>
@@ -455,7 +455,7 @@
         <w:rPr>
           <w:color w:val="1F4EB4"/>
         </w:rPr>
-        <w:t>E, no fim, Marrone contou o que o mantinha ali, apesar de tudo. "Deus pega na minha mão e diz: fica quieto, deixa a poeira baixar."</w:t>
+        <w:t>No fim, Marrone contou o que o mantinha ali, apesar de tudo. "Deus pega na minha mão e diz: fica quieto, deixa a poeira baixar."</w:t>
       </w:r>
     </w:p>
     <w:p>
@@ -463,7 +463,7 @@
         <w:rPr>
           <w:color w:val="1F4EB4"/>
         </w:rPr>
-        <w:t>Era isso. Trinta e seis anos de dupla resumidos numa frase. Um homem que precisava se proteger do parceiro, que pensava em abandonar o barco e que, mesmo assim, ficava. Porque acreditava que devia ficar.</w:t>
+        <w:t>Trinta e seis anos de dupla cabiam naquela frase. Um homem que pensava em abandonar o barco e, mesmo assim, ficava. Porque acreditava que devia ficar.</w:t>
       </w:r>
     </w:p>
     <w:p>
@@ -471,7 +471,7 @@
         <w:rPr>
           <w:color w:val="1F4EB4"/>
         </w:rPr>
-        <w:t>E quatro meses depois, veio a resposta de Bruno. Não para Marrone. Para o Brasil inteiro.</w:t>
+        <w:t>Quatro meses depois, foi a vez de Bruno falar de bebida diante das câmeras.</w:t>
       </w:r>
     </w:p>
     <w:p>
@@ -495,7 +495,7 @@
         <w:rPr>
           <w:color w:val="1F4EB4"/>
         </w:rPr>
-        <w:t>E disse uma frase que, relida hoje, dói.</w:t>
+        <w:t>A certa altura, soltou uma frase que, relida hoje, dói.</w:t>
       </w:r>
     </w:p>
     <w:p>
@@ -519,7 +519,7 @@
         <w:rPr>
           <w:color w:val="1F4EB4"/>
         </w:rPr>
-        <w:t>Lembra dos bares de Goiânia, das madrugadas com uma garrafa em cima de cada mesa, dos quinze anos esperando a vez deles? Tudo aquilo estava ali, naquela frase. O menino da farmácia tinha aprendido a cantar no mesmo lugar onde aprendeu a beber. E, pelas próprias palavras dele, as duas coisas tinham se misturado.</w:t>
+        <w:t>Lembra dos bares de Goiânia, das madrugadas com uma garrafa em cima de cada mesa, dos quinze anos esperando a vez deles? Tudo aquilo estava ali, naquela frase. O menino da farmácia tinha aprendido a cantar no mesmo lugar onde aprendeu a beber. Pelas próprias palavras dele, as duas coisas tinham se misturado.</w:t>
       </w:r>
     </w:p>
     <w:p>
@@ -535,7 +535,7 @@
         <w:rPr>
           <w:color w:val="1F4EB4"/>
         </w:rPr>
-        <w:t>Mas o que veio depois dessas duas entrevistas foi muito mais doloroso. Porque, nos cinco anos seguintes, a vida iria bater em Bruno de um jeito que nenhuma dose conseguiria anestesiar. E tudo ia desembocar numa noite de agosto de dois mil e vinte e seis, num palco de Uberlândia, diante de milhares de pessoas que tinham esperado sete anos para ver a dupla de novo.</w:t>
+        <w:t>Mas o que veio depois dessas duas entrevistas foi muito mais doloroso. Nos cinco anos seguintes, a vida iria bater em Bruno de um jeito que nenhuma dose conseguiria anestesiar. Tudo ia desembocar numa noite de agosto de dois mil e vinte e seis, num palco de Uberlândia, diante de milhares de pessoas que tinham esperado sete anos para ver a dupla de novo.</w:t>
       </w:r>
     </w:p>
     <w:sectPr>

</xml_diff>

<commit_message>
Bruno & Marrone: Parte 5, Barretos com Cuiabano Lima na Parte 4, data correta do The Noite na Parte 3
Co-Authored-By: Claude Opus 5.5 <noreply@anthropic.com>
Claude-Session: https://claude.ai/code/session_01MJjUEEZrxQDEUifKK2vj9g
</commit_message>
<xml_diff>
--- a/roteiros/bruno-marrone/BrunoMarrone_Parte3.docx
+++ b/roteiros/bruno-marrone/BrunoMarrone_Parte3.docx
@@ -471,7 +471,7 @@
         <w:rPr>
           <w:color w:val="1F4EB4"/>
         </w:rPr>
-        <w:t>Quatro meses depois, foi a vez de Bruno falar de bebida diante das câmeras.</w:t>
+        <w:t>Para medir o peso dessa confissão, é preciso voltar um ano no tempo. Porque Bruno já tinha dado a versão dele, com as próprias palavras, diante das câmeras.</w:t>
       </w:r>
     </w:p>
     <w:p>
@@ -479,7 +479,7 @@
         <w:rPr>
           <w:color w:val="1F4EB4"/>
         </w:rPr>
-        <w:t>Outubro de dois mil e vinte e um. Bruno foi entrevistado por Danilo Gentili, num programa de televisão.</w:t>
+        <w:t>Abril de dois mil e vinte, o mesmo mês daquela primeira live. Bruno e Marrone foram entrevistados por Danilo Gentili, no The Noite, do SBT.</w:t>
       </w:r>
     </w:p>
     <w:p>
@@ -527,7 +527,7 @@
         <w:rPr>
           <w:color w:val="1F4EB4"/>
         </w:rPr>
-        <w:t>No mesmo ano, os dois disseram a mesma verdade, de lados opostos. Marrone, com a voz baixa, dizendo que precisava se proteger. Bruno, rindo, dizendo que tinha aprendido a cantar bêbado.</w:t>
+        <w:t>Com pouco mais de um ano de distância, os dois disseram a mesma verdade, de lados opostos. Marrone, com a voz baixa, dizendo que precisava se proteger. Bruno, rindo, dizendo que tinha aprendido a cantar bêbado.</w:t>
       </w:r>
     </w:p>
     <w:p>

</xml_diff>